<commit_message>
Add live write-up link to IC memo header
</commit_message>
<xml_diff>
--- a/docs/IC_Memo.docx
+++ b/docs/IC_Memo.docx
@@ -114,6 +114,27 @@
           <w:szCs w:val="20"/>
         </w:rPr>
         <w:t xml:space="preserve">Rate-cycle sensitivity and distress signals across six leveraged credits</w:t>
+      </w:r>
+    </w:p>
+    <w:p>
+      <w:pPr>
+        <w:spacing w:after="40"/>
+      </w:pPr>
+      <w:r>
+        <w:rPr>
+          <w:b/>
+          <w:bCs/>
+          <w:sz w:val="20"/>
+          <w:szCs w:val="20"/>
+        </w:rPr>
+        <w:t xml:space="preserve">Live write-up: </w:t>
+      </w:r>
+      <w:r>
+        <w:rPr>
+          <w:sz w:val="20"/>
+          <w:szCs w:val="20"/>
+        </w:rPr>
+        <w:t xml:space="preserve">https://leverage-distress-simulator.netlify.app</w:t>
       </w:r>
     </w:p>
     <w:p>

</xml_diff>